<commit_message>
docs: policy and consent 1.3 name Amazon as a recipient; Word files rebuilt
Sonnet replies run on Amazon Bedrock (seen in the live measurement), which the recipient lists did not name. Added
Amazon Web Services, Inc. to the policy table and 6.2 and to the consent. The Word files are rebuilt from the current
markdown (they still had the 1.1 text with a drafting note); the offer's Word file already matches its markdown.

Co-Authored-By: Claude Sonnet 5.5 <noreply@anthropic.com>
</commit_message>
<xml_diff>
--- a/docs/legal/word/ПОЛИТИКА-ПД-StaySee-2026-06-28.docx
+++ b/docs/legal/word/ПОЛИТИКА-ПД-StaySee-2026-06-28.docx
@@ -2,7 +2,7 @@
 <file path=word/document.xml><?xml version="1.0" encoding="utf-8"?>
 <w:document xmlns:w="http://schemas.openxmlformats.org/wordprocessingml/2006/main" xmlns:m="http://schemas.openxmlformats.org/officeDocument/2006/math" xmlns:r="http://schemas.openxmlformats.org/officeDocument/2006/relationships" xmlns:o="urn:schemas-microsoft-com:office:office" xmlns:v="urn:schemas-microsoft-com:vml" xmlns:w10="urn:schemas-microsoft-com:office:word" xmlns:a="http://schemas.openxmlformats.org/drawingml/2006/main" xmlns:pic="http://schemas.openxmlformats.org/drawingml/2006/picture" xmlns:wp="http://schemas.openxmlformats.org/drawingml/2006/wordprocessingDrawing">
   <w:body>
-    <w:bookmarkStart w:id="25" w:name="политика-обработки-персональных-данных"/>
+    <w:bookmarkStart w:id="26" w:name="политика-обработки-персональных-данных"/>
     <w:p>
       <w:pPr>
         <w:pStyle w:val="Heading1"/>
@@ -35,7 +35,7 @@
         <w:t xml:space="preserve"> </w:t>
       </w:r>
       <w:r>
-        <w:t xml:space="preserve">28 июня 2026 г.</w:t>
+        <w:t xml:space="preserve">31 октября 2026 г.</w:t>
       </w:r>
       <w:r>
         <w:br/>
@@ -51,15 +51,7 @@
         <w:t xml:space="preserve"> </w:t>
       </w:r>
       <w:r>
-        <w:t xml:space="preserve">1.1</w:t>
-      </w:r>
-    </w:p>
-    <w:p>
-      <w:pPr>
-        <w:pStyle w:val="BlockText"/>
-      </w:pPr>
-      <w:r>
-        <w:t xml:space="preserve">Реквизиты ИП внесены. Перед публикацией: заполнить номер уведомления в РКН о трансграничной передаче (ст. 12 152-ФЗ) после его подачи. Рекомендуется консультация с юристом.</w:t>
+        <w:t xml:space="preserve">1.3</w:t>
       </w:r>
     </w:p>
     <w:p>
@@ -239,7 +231,7 @@
       </w:r>
     </w:p>
     <w:bookmarkEnd w:id="10"/>
-    <w:bookmarkStart w:id="14" w:name="Xef9ddebd0ee0014355d21eeffb22a08d4cf9ef1"/>
+    <w:bookmarkStart w:id="15" w:name="Xef9ddebd0ee0014355d21eeffb22a08d4cf9ef1"/>
     <w:p>
       <w:pPr>
         <w:pStyle w:val="Heading2"/>
@@ -447,6 +439,41 @@
           </w:p>
         </w:tc>
       </w:tr>
+      <w:tr>
+        <w:tc>
+          <w:tcPr/>
+          <w:p>
+            <w:pPr>
+              <w:pStyle w:val="Compact"/>
+            </w:pPr>
+            <w:r>
+              <w:t xml:space="preserve">Изображения</w:t>
+            </w:r>
+          </w:p>
+        </w:tc>
+        <w:tc>
+          <w:tcPr/>
+          <w:p>
+            <w:pPr>
+              <w:pStyle w:val="Compact"/>
+            </w:pPr>
+            <w:r>
+              <w:t xml:space="preserve">Фотографии и скриншоты, которые Пользователь прикрепляет к сообщению (по своему желанию)</w:t>
+            </w:r>
+          </w:p>
+        </w:tc>
+        <w:tc>
+          <w:tcPr/>
+          <w:p>
+            <w:pPr>
+              <w:pStyle w:val="Compact"/>
+            </w:pPr>
+            <w:r>
+              <w:t xml:space="preserve">Показ изображения языковой модели при формировании ответа; составление текстового описания изображения</w:t>
+            </w:r>
+          </w:p>
+        </w:tc>
+      </w:tr>
     </w:tbl>
     <w:bookmarkEnd w:id="11"/>
     <w:bookmarkStart w:id="12" w:name="данные-собираемые-автоматически"/>
@@ -593,15 +620,139 @@
       </w:r>
     </w:p>
     <w:p>
+      <w:pPr>
+        <w:pStyle w:val="BodyText"/>
+      </w:pPr>
+      <w:r>
+        <w:t xml:space="preserve">Изображения, которые Пользователь прикрепляет к сообщению, могут содержать сведения о здоровье и внешности Пользователя. Оператор не использует изображения для распознавания или опознавания людей и не обрабатывает их как биометрические персональные данные.</w:t>
+      </w:r>
+    </w:p>
+    <w:bookmarkEnd w:id="13"/>
+    <w:bookmarkStart w:id="14" w:name="изображения"/>
+    <w:p>
+      <w:pPr>
+        <w:pStyle w:val="Heading3"/>
+      </w:pPr>
+      <w:r>
+        <w:t xml:space="preserve">2.4. Изображения</w:t>
+      </w:r>
+    </w:p>
+    <w:p>
+      <w:pPr>
+        <w:pStyle w:val="FirstParagraph"/>
+      </w:pPr>
+      <w:r>
+        <w:rPr>
+          <w:b/>
+          <w:bCs/>
+        </w:rPr>
+        <w:t xml:space="preserve">2.4.1.</w:t>
+      </w:r>
+      <w:r>
+        <w:t xml:space="preserve"> </w:t>
+      </w:r>
+      <w:r>
+        <w:t xml:space="preserve">Изображение прикрепляется Пользователем по желанию. Перед первым прикреплением Пользователь подтверждает отдельное согласие на обработку изображений.</w:t>
+      </w:r>
+    </w:p>
+    <w:p>
+      <w:pPr>
+        <w:pStyle w:val="BodyText"/>
+      </w:pPr>
+      <w:r>
+        <w:rPr>
+          <w:b/>
+          <w:bCs/>
+        </w:rPr>
+        <w:t xml:space="preserve">2.4.2.</w:t>
+      </w:r>
+      <w:r>
+        <w:t xml:space="preserve"> </w:t>
+      </w:r>
+      <w:r>
+        <w:t xml:space="preserve">Оператор</w:t>
+      </w:r>
+      <w:r>
+        <w:t xml:space="preserve"> </w:t>
+      </w:r>
+      <w:r>
+        <w:rPr>
+          <w:b/>
+          <w:bCs/>
+        </w:rPr>
+        <w:t xml:space="preserve">не хранит</w:t>
+      </w:r>
+      <w:r>
+        <w:t xml:space="preserve"> </w:t>
+      </w:r>
+      <w:r>
+        <w:t xml:space="preserve">сами изображения. Изображение передаётся языковой модели на время формирования ответа; отдельная языковая модель составляет его краткое текстовое описание, которое сохраняется в беседе Пользователя как часть сообщения и используется так же, как остальной текст переписки (в том числе для памяти Сервиса).</w:t>
+      </w:r>
+    </w:p>
+    <w:p>
+      <w:pPr>
+        <w:pStyle w:val="BodyText"/>
+      </w:pPr>
+      <w:r>
+        <w:rPr>
+          <w:b/>
+          <w:bCs/>
+        </w:rPr>
+        <w:t xml:space="preserve">2.4.3.</w:t>
+      </w:r>
+      <w:r>
+        <w:t xml:space="preserve"> </w:t>
+      </w:r>
+      <w:r>
+        <w:t xml:space="preserve">Описание не содержит имён, телефонов и адресов третьих лиц, которые видны на изображении, и не содержит попыток опознать людей по лицу. Содержимое надписей на изображении Сервис рассматривает как содержание изображения, а не как указания.</w:t>
+      </w:r>
+    </w:p>
+    <w:p>
+      <w:pPr>
+        <w:pStyle w:val="BodyText"/>
+      </w:pPr>
+      <w:r>
+        <w:rPr>
+          <w:b/>
+          <w:bCs/>
+        </w:rPr>
+        <w:t xml:space="preserve">2.4.4.</w:t>
+      </w:r>
+      <w:r>
+        <w:t xml:space="preserve"> </w:t>
+      </w:r>
+      <w:r>
+        <w:t xml:space="preserve">Пользователь прикрепляет изображения других людей и их переписку только если вправе это делать, и не прикрепляет изображения документов, удостоверяющих личность, платёжных карт и экранов с паролями.</w:t>
+      </w:r>
+    </w:p>
+    <w:p>
+      <w:pPr>
+        <w:pStyle w:val="BodyText"/>
+      </w:pPr>
+      <w:r>
+        <w:rPr>
+          <w:b/>
+          <w:bCs/>
+        </w:rPr>
+        <w:t xml:space="preserve">2.4.5.</w:t>
+      </w:r>
+      <w:r>
+        <w:t xml:space="preserve"> </w:t>
+      </w:r>
+      <w:r>
+        <w:t xml:space="preserve">Количество изображений ограничено: не более трёх в одном сообщении и не более двадцати в сутки.</w:t>
+      </w:r>
+    </w:p>
+    <w:p>
       <w:r>
         <w:pict>
           <v:rect style="width:0;height:1.5pt" o:hralign="center" o:hrstd="t" o:hr="t"/>
         </w:pict>
       </w:r>
     </w:p>
-    <w:bookmarkEnd w:id="13"/>
     <w:bookmarkEnd w:id="14"/>
-    <w:bookmarkStart w:id="15" w:name="цели-обработки-персональных-данных"/>
+    <w:bookmarkEnd w:id="15"/>
+    <w:bookmarkStart w:id="16" w:name="цели-обработки-персональных-данных"/>
     <w:p>
       <w:pPr>
         <w:pStyle w:val="Heading2"/>
@@ -631,7 +782,7 @@
         </w:numPr>
       </w:pPr>
       <w:r>
-        <w:t xml:space="preserve">Техническая поддержка учётной записи и обеспечение безопасности.</w:t>
+        <w:t xml:space="preserve">Показ изображений, прикреплённых Пользователем, языковой модели и составление их текстового описания.</w:t>
       </w:r>
     </w:p>
     <w:p>
@@ -643,7 +794,7 @@
         </w:numPr>
       </w:pPr>
       <w:r>
-        <w:t xml:space="preserve">Направление уведомлений об изменениях условий Сервиса.</w:t>
+        <w:t xml:space="preserve">Техническая поддержка учётной записи и обеспечение безопасности.</w:t>
       </w:r>
     </w:p>
     <w:p>
@@ -655,7 +806,7 @@
         </w:numPr>
       </w:pPr>
       <w:r>
-        <w:t xml:space="preserve">Обработка платежей и возвратов (через Робокасса).</w:t>
+        <w:t xml:space="preserve">Направление уведомлений об изменениях условий Сервиса.</w:t>
       </w:r>
     </w:p>
     <w:p>
@@ -667,6 +818,18 @@
         </w:numPr>
       </w:pPr>
       <w:r>
+        <w:t xml:space="preserve">Обработка платежей и возвратов (через Робокасса).</w:t>
+      </w:r>
+    </w:p>
+    <w:p>
+      <w:pPr>
+        <w:pStyle w:val="Compact"/>
+        <w:numPr>
+          <w:ilvl w:val="0"/>
+          <w:numId w:val="1001"/>
+        </w:numPr>
+      </w:pPr>
+      <w:r>
         <w:t xml:space="preserve">Исполнение требований законодательства РФ.</w:t>
       </w:r>
     </w:p>
@@ -677,8 +840,8 @@
         </w:pict>
       </w:r>
     </w:p>
-    <w:bookmarkEnd w:id="15"/>
-    <w:bookmarkStart w:id="16" w:name="правовые-основания-обработки"/>
+    <w:bookmarkEnd w:id="16"/>
+    <w:bookmarkStart w:id="17" w:name="правовые-основания-обработки"/>
     <w:p>
       <w:pPr>
         <w:pStyle w:val="Heading2"/>
@@ -805,6 +968,30 @@
               <w:pStyle w:val="Compact"/>
             </w:pPr>
             <w:r>
+              <w:t xml:space="preserve">Изображения</w:t>
+            </w:r>
+          </w:p>
+        </w:tc>
+        <w:tc>
+          <w:tcPr/>
+          <w:p>
+            <w:pPr>
+              <w:pStyle w:val="Compact"/>
+            </w:pPr>
+            <w:r>
+              <w:t xml:space="preserve">Явное согласие (п. 1 ч. 1 ст. 6 и п. 1 ч. 2 ст. 10 152-ФЗ), даваемое отдельно при первом прикреплении изображения</w:t>
+            </w:r>
+          </w:p>
+        </w:tc>
+      </w:tr>
+      <w:tr>
+        <w:tc>
+          <w:tcPr/>
+          <w:p>
+            <w:pPr>
+              <w:pStyle w:val="Compact"/>
+            </w:pPr>
+            <w:r>
               <w:t xml:space="preserve">Технические данные</w:t>
             </w:r>
           </w:p>
@@ -853,8 +1040,8 @@
         </w:pict>
       </w:r>
     </w:p>
-    <w:bookmarkEnd w:id="16"/>
-    <w:bookmarkStart w:id="17" w:name="передача-данных-третьим-лицам"/>
+    <w:bookmarkEnd w:id="17"/>
+    <w:bookmarkStart w:id="18" w:name="передача-данных-третьим-лицам"/>
     <w:p>
       <w:pPr>
         <w:pStyle w:val="Heading2"/>
@@ -986,20 +1173,20 @@
               <w:pStyle w:val="Compact"/>
             </w:pPr>
             <w:r>
-              <w:t xml:space="preserve">Маршрутизация запросов к языковым моделям ИИ</w:t>
-            </w:r>
-          </w:p>
-        </w:tc>
-      </w:tr>
-      <w:tr>
-        <w:tc>
-          <w:tcPr/>
-          <w:p>
-            <w:pPr>
-              <w:pStyle w:val="Compact"/>
-            </w:pPr>
-            <w:r>
-              <w:t xml:space="preserve">Anthropic, PBC</w:t>
+              <w:t xml:space="preserve">Посредник: маршрутизация запросов к языковым моделям ИИ</w:t>
+            </w:r>
+          </w:p>
+        </w:tc>
+      </w:tr>
+      <w:tr>
+        <w:tc>
+          <w:tcPr/>
+          <w:p>
+            <w:pPr>
+              <w:pStyle w:val="Compact"/>
+            </w:pPr>
+            <w:r>
+              <w:t xml:space="preserve">OpenAI, L.L.C. и Microsoft Corporation (сервис Azure OpenAI)</w:t>
             </w:r>
           </w:p>
         </w:tc>
@@ -1021,7 +1208,77 @@
               <w:pStyle w:val="Compact"/>
             </w:pPr>
             <w:r>
-              <w:t xml:space="preserve">Обработка текста языковыми моделями для генерации ответов</w:t>
+              <w:t xml:space="preserve">Обработка текста и изображений языковой моделью для генерации ответов</w:t>
+            </w:r>
+          </w:p>
+        </w:tc>
+      </w:tr>
+      <w:tr>
+        <w:tc>
+          <w:tcPr/>
+          <w:p>
+            <w:pPr>
+              <w:pStyle w:val="Compact"/>
+            </w:pPr>
+            <w:r>
+              <w:t xml:space="preserve">Google LLC (сервис Vertex AI)</w:t>
+            </w:r>
+          </w:p>
+        </w:tc>
+        <w:tc>
+          <w:tcPr/>
+          <w:p>
+            <w:pPr>
+              <w:pStyle w:val="Compact"/>
+            </w:pPr>
+            <w:r>
+              <w:t xml:space="preserve">США</w:t>
+            </w:r>
+          </w:p>
+        </w:tc>
+        <w:tc>
+          <w:tcPr/>
+          <w:p>
+            <w:pPr>
+              <w:pStyle w:val="Compact"/>
+            </w:pPr>
+            <w:r>
+              <w:t xml:space="preserve">Обработка текста и изображений языковой моделью для формирования памяти и описаний изображений</w:t>
+            </w:r>
+          </w:p>
+        </w:tc>
+      </w:tr>
+      <w:tr>
+        <w:tc>
+          <w:tcPr/>
+          <w:p>
+            <w:pPr>
+              <w:pStyle w:val="Compact"/>
+            </w:pPr>
+            <w:r>
+              <w:t xml:space="preserve">Anthropic, PBC и Amazon Web Services, Inc. (сервис Amazon Bedrock)</w:t>
+            </w:r>
+          </w:p>
+        </w:tc>
+        <w:tc>
+          <w:tcPr/>
+          <w:p>
+            <w:pPr>
+              <w:pStyle w:val="Compact"/>
+            </w:pPr>
+            <w:r>
+              <w:t xml:space="preserve">США</w:t>
+            </w:r>
+          </w:p>
+        </w:tc>
+        <w:tc>
+          <w:tcPr/>
+          <w:p>
+            <w:pPr>
+              <w:pStyle w:val="Compact"/>
+            </w:pPr>
+            <w:r>
+              <w:t xml:space="preserve">Обработка текста и изображений языковой моделью для генерации ответов (часть ответов и резервная модель)</w:t>
             </w:r>
           </w:p>
         </w:tc>
@@ -1137,7 +1394,7 @@
         <w:pStyle w:val="BodyText"/>
       </w:pPr>
       <w:r>
-        <w:t xml:space="preserve">Оператор не продаёт персональные данные Пользователей третьим лицам.</w:t>
+        <w:t xml:space="preserve">Оператор не продаёт персональные данные Пользователей третьим лицам. Серверы поставщиков языковых моделей могут находиться в США и в других странах: перечень определяется самими поставщиками.</w:t>
       </w:r>
     </w:p>
     <w:p>
@@ -1145,6 +1402,14 @@
         <w:pStyle w:val="BodyText"/>
       </w:pPr>
       <w:r>
+        <w:t xml:space="preserve">Поставщики языковых моделей получают данные только для выполнения запроса Оператора. Оператор не использует содержимое переписки и изображения для обучения моделей и не передаёт их поставщикам для обучения; по опубликованным условиям поставщиков для доступа через программный интерфейс (API) переданные таким образом данные не используются для обучения их моделей.</w:t>
+      </w:r>
+    </w:p>
+    <w:p>
+      <w:pPr>
+        <w:pStyle w:val="BodyText"/>
+      </w:pPr>
+      <w:r>
         <w:rPr>
           <w:b/>
           <w:bCs/>
@@ -1156,6 +1421,14 @@
       </w:r>
       <w:r>
         <w:t xml:space="preserve">Сервис не предназначен для хранения и обработки следующих категорий данных: реквизиты платёжных инструментов (номера банковских карт, CVV/CVC-коды), данные документов, удостоверяющих личность (серия и номер паспорта, СНИЛС, ИНН физического лица), логины и пароли от сторонних сервисов. Пользователь уведомляется об этом при начале каждого диалога. Указание таких сведений в тексте переписки осуществляется Пользователем самостоятельно и на его собственный риск; Оператор не несёт ответственности за последствия такого указания.</w:t>
+      </w:r>
+    </w:p>
+    <w:p>
+      <w:pPr>
+        <w:pStyle w:val="BodyText"/>
+      </w:pPr>
+      <w:r>
+        <w:t xml:space="preserve">Это относится и к изображениям: не прикрепляйте фотографии документов, платёжных карт и экранов с паролями.</w:t>
       </w:r>
     </w:p>
     <w:p>
@@ -1165,8 +1438,8 @@
         </w:pict>
       </w:r>
     </w:p>
-    <w:bookmarkEnd w:id="17"/>
-    <w:bookmarkStart w:id="18" w:name="Xc335fa9f9a9de991e4235990f8839e9ef16dec0"/>
+    <w:bookmarkEnd w:id="18"/>
+    <w:bookmarkStart w:id="19" w:name="Xc335fa9f9a9de991e4235990f8839e9ef16dec0"/>
     <w:p>
       <w:pPr>
         <w:pStyle w:val="Heading2"/>
@@ -1234,6 +1507,58 @@
         <w:t xml:space="preserve">OpenRouter, Inc.</w:t>
       </w:r>
       <w:r>
+        <w:t xml:space="preserve">,</w:t>
+      </w:r>
+      <w:r>
+        <w:t xml:space="preserve"> </w:t>
+      </w:r>
+      <w:r>
+        <w:rPr>
+          <w:b/>
+          <w:bCs/>
+        </w:rPr>
+        <w:t xml:space="preserve">OpenAI, L.L.C.</w:t>
+      </w:r>
+      <w:r>
+        <w:t xml:space="preserve">,</w:t>
+      </w:r>
+      <w:r>
+        <w:t xml:space="preserve"> </w:t>
+      </w:r>
+      <w:r>
+        <w:rPr>
+          <w:b/>
+          <w:bCs/>
+        </w:rPr>
+        <w:t xml:space="preserve">Microsoft Corporation</w:t>
+      </w:r>
+      <w:r>
+        <w:t xml:space="preserve">,</w:t>
+      </w:r>
+      <w:r>
+        <w:t xml:space="preserve"> </w:t>
+      </w:r>
+      <w:r>
+        <w:rPr>
+          <w:b/>
+          <w:bCs/>
+        </w:rPr>
+        <w:t xml:space="preserve">Google LLC</w:t>
+      </w:r>
+      <w:r>
+        <w:t xml:space="preserve">,</w:t>
+      </w:r>
+      <w:r>
+        <w:t xml:space="preserve"> </w:t>
+      </w:r>
+      <w:r>
+        <w:rPr>
+          <w:b/>
+          <w:bCs/>
+        </w:rPr>
+        <w:t xml:space="preserve">Amazon Web Services, Inc.</w:t>
+      </w:r>
+      <w:r>
         <w:t xml:space="preserve"> </w:t>
       </w:r>
       <w:r>
@@ -1266,7 +1591,7 @@
         <w:t xml:space="preserve">США</w:t>
       </w:r>
       <w:r>
-        <w:t xml:space="preserve">. Соединённые Штаты Америки не включены Роскомнадзором в список государств, обеспечивающих надлежащий уровень защиты персональных данных. Передача осуществляется на основании явного согласия Пользователя (п. 1 ч. 4 ст. 12 152-ФЗ).</w:t>
+        <w:t xml:space="preserve">; серверы поставщиков языковых моделей могут находиться и в других странах. Соединённые Штаты Америки не включены Роскомнадзором в список государств, обеспечивающих надлежащий уровень защиты персональных данных. Передача осуществляется на основании явного согласия Пользователя (п. 1 ч. 4 ст. 12 152-ФЗ).</w:t>
       </w:r>
     </w:p>
     <w:p>
@@ -1307,8 +1632,8 @@
         </w:pict>
       </w:r>
     </w:p>
-    <w:bookmarkEnd w:id="18"/>
-    <w:bookmarkStart w:id="19" w:name="меры-защиты-персональных-данных"/>
+    <w:bookmarkEnd w:id="19"/>
+    <w:bookmarkStart w:id="20" w:name="меры-защиты-персональных-данных"/>
     <w:p>
       <w:pPr>
         <w:pStyle w:val="Heading2"/>
@@ -1362,8 +1687,8 @@
         </w:pict>
       </w:r>
     </w:p>
-    <w:bookmarkEnd w:id="19"/>
-    <w:bookmarkStart w:id="20" w:name="сроки-хранения-данных"/>
+    <w:bookmarkEnd w:id="20"/>
+    <w:bookmarkStart w:id="21" w:name="сроки-хранения-данных"/>
     <w:p>
       <w:pPr>
         <w:pStyle w:val="Heading2"/>
@@ -1466,6 +1791,30 @@
               <w:pStyle w:val="Compact"/>
             </w:pPr>
             <w:r>
+              <w:t xml:space="preserve">Изображения</w:t>
+            </w:r>
+          </w:p>
+        </w:tc>
+        <w:tc>
+          <w:tcPr/>
+          <w:p>
+            <w:pPr>
+              <w:pStyle w:val="Compact"/>
+            </w:pPr>
+            <w:r>
+              <w:t xml:space="preserve">Оператором не хранятся; текстовое описание изображения хранится как часть переписки (см. выше)</w:t>
+            </w:r>
+          </w:p>
+        </w:tc>
+      </w:tr>
+      <w:tr>
+        <w:tc>
+          <w:tcPr/>
+          <w:p>
+            <w:pPr>
+              <w:pStyle w:val="Compact"/>
+            </w:pPr>
+            <w:r>
               <w:t xml:space="preserve">Данные о платежах</w:t>
             </w:r>
           </w:p>
@@ -1538,8 +1887,8 @@
         </w:pict>
       </w:r>
     </w:p>
-    <w:bookmarkEnd w:id="20"/>
-    <w:bookmarkStart w:id="21" w:name="права-субъекта-персональных-данных"/>
+    <w:bookmarkEnd w:id="21"/>
+    <w:bookmarkStart w:id="22" w:name="права-субъекта-персональных-данных"/>
     <w:p>
       <w:pPr>
         <w:pStyle w:val="Heading2"/>
@@ -1694,8 +2043,8 @@
         </w:pict>
       </w:r>
     </w:p>
-    <w:bookmarkEnd w:id="21"/>
-    <w:bookmarkStart w:id="22" w:name="обработка-данных-несовершеннолетних"/>
+    <w:bookmarkEnd w:id="22"/>
+    <w:bookmarkStart w:id="23" w:name="обработка-данных-несовершеннолетних"/>
     <w:p>
       <w:pPr>
         <w:pStyle w:val="Heading2"/>
@@ -1719,8 +2068,8 @@
         </w:pict>
       </w:r>
     </w:p>
-    <w:bookmarkEnd w:id="22"/>
-    <w:bookmarkStart w:id="23" w:name="изменения-в-политике"/>
+    <w:bookmarkEnd w:id="23"/>
+    <w:bookmarkStart w:id="24" w:name="изменения-в-политике"/>
     <w:p>
       <w:pPr>
         <w:pStyle w:val="Heading2"/>
@@ -1788,8 +2137,8 @@
         </w:pict>
       </w:r>
     </w:p>
-    <w:bookmarkEnd w:id="23"/>
-    <w:bookmarkStart w:id="24" w:name="реквизиты-и-контакты"/>
+    <w:bookmarkEnd w:id="24"/>
+    <w:bookmarkStart w:id="25" w:name="реквизиты-и-контакты"/>
     <w:p>
       <w:pPr>
         <w:pStyle w:val="Heading2"/>
@@ -2033,8 +2382,8 @@
         </w:tc>
       </w:tr>
     </w:tbl>
-    <w:bookmarkEnd w:id="24"/>
     <w:bookmarkEnd w:id="25"/>
+    <w:bookmarkEnd w:id="26"/>
     <w:sectPr>
       <w:footnotePr>
         <w:numRestart w:val="eachSect"/>
@@ -2913,7 +3262,7 @@
       <w:color w:themeColor="accent1" w:themeShade="BF" w:val="365F91"/>
     </w:rPr>
   </w:style>
-  <w:style w:type="paragraph" w:customStyle="1" w:styleId="SourceCode">
+  <w:style w:customStyle="1" w:styleId="SourceCode" w:type="paragraph">
     <w:name w:val="Source Code"/>
     <w:basedOn w:val="Normal"/>
     <w:link w:val="VerbatimChar"/>
@@ -2921,7 +3270,7 @@
       <w:wordWrap w:val="off"/>
     </w:pPr>
   </w:style>
-  <w:style w:type="character" w:customStyle="1" w:styleId="KeywordTok">
+  <w:style w:customStyle="1" w:styleId="KeywordTok" w:type="character">
     <w:name w:val="KeywordTok"/>
     <w:basedOn w:val="VerbatimChar"/>
     <w:rPr>
@@ -2929,77 +3278,77 @@
       <w:color w:val="007020"/>
     </w:rPr>
   </w:style>
-  <w:style w:type="character" w:customStyle="1" w:styleId="DataTypeTok">
+  <w:style w:customStyle="1" w:styleId="DataTypeTok" w:type="character">
     <w:name w:val="DataTypeTok"/>
     <w:basedOn w:val="VerbatimChar"/>
     <w:rPr>
       <w:color w:val="902000"/>
     </w:rPr>
   </w:style>
-  <w:style w:type="character" w:customStyle="1" w:styleId="DecValTok">
+  <w:style w:customStyle="1" w:styleId="DecValTok" w:type="character">
     <w:name w:val="DecValTok"/>
     <w:basedOn w:val="VerbatimChar"/>
     <w:rPr>
       <w:color w:val="40a070"/>
     </w:rPr>
   </w:style>
-  <w:style w:type="character" w:customStyle="1" w:styleId="BaseNTok">
+  <w:style w:customStyle="1" w:styleId="BaseNTok" w:type="character">
     <w:name w:val="BaseNTok"/>
     <w:basedOn w:val="VerbatimChar"/>
     <w:rPr>
       <w:color w:val="40a070"/>
     </w:rPr>
   </w:style>
-  <w:style w:type="character" w:customStyle="1" w:styleId="FloatTok">
+  <w:style w:customStyle="1" w:styleId="FloatTok" w:type="character">
     <w:name w:val="FloatTok"/>
     <w:basedOn w:val="VerbatimChar"/>
     <w:rPr>
       <w:color w:val="40a070"/>
     </w:rPr>
   </w:style>
-  <w:style w:type="character" w:customStyle="1" w:styleId="ConstantTok">
+  <w:style w:customStyle="1" w:styleId="ConstantTok" w:type="character">
     <w:name w:val="ConstantTok"/>
     <w:basedOn w:val="VerbatimChar"/>
     <w:rPr>
       <w:color w:val="880000"/>
     </w:rPr>
   </w:style>
-  <w:style w:type="character" w:customStyle="1" w:styleId="CharTok">
+  <w:style w:customStyle="1" w:styleId="CharTok" w:type="character">
     <w:name w:val="CharTok"/>
     <w:basedOn w:val="VerbatimChar"/>
     <w:rPr>
       <w:color w:val="4070a0"/>
     </w:rPr>
   </w:style>
-  <w:style w:type="character" w:customStyle="1" w:styleId="SpecialCharTok">
+  <w:style w:customStyle="1" w:styleId="SpecialCharTok" w:type="character">
     <w:name w:val="SpecialCharTok"/>
     <w:basedOn w:val="VerbatimChar"/>
     <w:rPr>
       <w:color w:val="4070a0"/>
     </w:rPr>
   </w:style>
-  <w:style w:type="character" w:customStyle="1" w:styleId="StringTok">
+  <w:style w:customStyle="1" w:styleId="StringTok" w:type="character">
     <w:name w:val="StringTok"/>
     <w:basedOn w:val="VerbatimChar"/>
     <w:rPr>
       <w:color w:val="4070a0"/>
     </w:rPr>
   </w:style>
-  <w:style w:type="character" w:customStyle="1" w:styleId="VerbatimStringTok">
+  <w:style w:customStyle="1" w:styleId="VerbatimStringTok" w:type="character">
     <w:name w:val="VerbatimStringTok"/>
     <w:basedOn w:val="VerbatimChar"/>
     <w:rPr>
       <w:color w:val="4070a0"/>
     </w:rPr>
   </w:style>
-  <w:style w:type="character" w:customStyle="1" w:styleId="SpecialStringTok">
+  <w:style w:customStyle="1" w:styleId="SpecialStringTok" w:type="character">
     <w:name w:val="SpecialStringTok"/>
     <w:basedOn w:val="VerbatimChar"/>
     <w:rPr>
       <w:color w:val="bb6688"/>
     </w:rPr>
   </w:style>
-  <w:style w:type="character" w:customStyle="1" w:styleId="ImportTok">
+  <w:style w:customStyle="1" w:styleId="ImportTok" w:type="character">
     <w:name w:val="ImportTok"/>
     <w:basedOn w:val="VerbatimChar"/>
     <w:rPr>
@@ -3007,7 +3356,7 @@
       <w:color w:val="008000"/>
     </w:rPr>
   </w:style>
-  <w:style w:type="character" w:customStyle="1" w:styleId="CommentTok">
+  <w:style w:customStyle="1" w:styleId="CommentTok" w:type="character">
     <w:name w:val="CommentTok"/>
     <w:basedOn w:val="VerbatimChar"/>
     <w:rPr>
@@ -3015,7 +3364,7 @@
       <w:color w:val="60a0b0"/>
     </w:rPr>
   </w:style>
-  <w:style w:type="character" w:customStyle="1" w:styleId="DocumentationTok">
+  <w:style w:customStyle="1" w:styleId="DocumentationTok" w:type="character">
     <w:name w:val="DocumentationTok"/>
     <w:basedOn w:val="VerbatimChar"/>
     <w:rPr>
@@ -3023,7 +3372,7 @@
       <w:color w:val="ba2121"/>
     </w:rPr>
   </w:style>
-  <w:style w:type="character" w:customStyle="1" w:styleId="AnnotationTok">
+  <w:style w:customStyle="1" w:styleId="AnnotationTok" w:type="character">
     <w:name w:val="AnnotationTok"/>
     <w:basedOn w:val="VerbatimChar"/>
     <w:rPr>
@@ -3032,7 +3381,7 @@
       <w:color w:val="60a0b0"/>
     </w:rPr>
   </w:style>
-  <w:style w:type="character" w:customStyle="1" w:styleId="CommentVarTok">
+  <w:style w:customStyle="1" w:styleId="CommentVarTok" w:type="character">
     <w:name w:val="CommentVarTok"/>
     <w:basedOn w:val="VerbatimChar"/>
     <w:rPr>
@@ -3041,28 +3390,28 @@
       <w:color w:val="60a0b0"/>
     </w:rPr>
   </w:style>
-  <w:style w:type="character" w:customStyle="1" w:styleId="OtherTok">
+  <w:style w:customStyle="1" w:styleId="OtherTok" w:type="character">
     <w:name w:val="OtherTok"/>
     <w:basedOn w:val="VerbatimChar"/>
     <w:rPr>
       <w:color w:val="007020"/>
     </w:rPr>
   </w:style>
-  <w:style w:type="character" w:customStyle="1" w:styleId="FunctionTok">
+  <w:style w:customStyle="1" w:styleId="FunctionTok" w:type="character">
     <w:name w:val="FunctionTok"/>
     <w:basedOn w:val="VerbatimChar"/>
     <w:rPr>
       <w:color w:val="06287e"/>
     </w:rPr>
   </w:style>
-  <w:style w:type="character" w:customStyle="1" w:styleId="VariableTok">
+  <w:style w:customStyle="1" w:styleId="VariableTok" w:type="character">
     <w:name w:val="VariableTok"/>
     <w:basedOn w:val="VerbatimChar"/>
     <w:rPr>
       <w:color w:val="19177c"/>
     </w:rPr>
   </w:style>
-  <w:style w:type="character" w:customStyle="1" w:styleId="ControlFlowTok">
+  <w:style w:customStyle="1" w:styleId="ControlFlowTok" w:type="character">
     <w:name w:val="ControlFlowTok"/>
     <w:basedOn w:val="VerbatimChar"/>
     <w:rPr>
@@ -3070,45 +3419,45 @@
       <w:color w:val="007020"/>
     </w:rPr>
   </w:style>
-  <w:style w:type="character" w:customStyle="1" w:styleId="OperatorTok">
+  <w:style w:customStyle="1" w:styleId="OperatorTok" w:type="character">
     <w:name w:val="OperatorTok"/>
     <w:basedOn w:val="VerbatimChar"/>
     <w:rPr>
       <w:color w:val="666666"/>
     </w:rPr>
   </w:style>
-  <w:style w:type="character" w:customStyle="1" w:styleId="BuiltInTok">
+  <w:style w:customStyle="1" w:styleId="BuiltInTok" w:type="character">
     <w:name w:val="BuiltInTok"/>
     <w:basedOn w:val="VerbatimChar"/>
     <w:rPr>
       <w:color w:val="008000"/>
     </w:rPr>
   </w:style>
-  <w:style w:type="character" w:customStyle="1" w:styleId="ExtensionTok">
+  <w:style w:customStyle="1" w:styleId="ExtensionTok" w:type="character">
     <w:name w:val="ExtensionTok"/>
     <w:basedOn w:val="VerbatimChar"/>
     <w:rPr/>
   </w:style>
-  <w:style w:type="character" w:customStyle="1" w:styleId="PreprocessorTok">
+  <w:style w:customStyle="1" w:styleId="PreprocessorTok" w:type="character">
     <w:name w:val="PreprocessorTok"/>
     <w:basedOn w:val="VerbatimChar"/>
     <w:rPr>
       <w:color w:val="bc7a00"/>
     </w:rPr>
   </w:style>
-  <w:style w:type="character" w:customStyle="1" w:styleId="AttributeTok">
+  <w:style w:customStyle="1" w:styleId="AttributeTok" w:type="character">
     <w:name w:val="AttributeTok"/>
     <w:basedOn w:val="VerbatimChar"/>
     <w:rPr>
       <w:color w:val="7d9029"/>
     </w:rPr>
   </w:style>
-  <w:style w:type="character" w:customStyle="1" w:styleId="RegionMarkerTok">
+  <w:style w:customStyle="1" w:styleId="RegionMarkerTok" w:type="character">
     <w:name w:val="RegionMarkerTok"/>
     <w:basedOn w:val="VerbatimChar"/>
     <w:rPr/>
   </w:style>
-  <w:style w:type="character" w:customStyle="1" w:styleId="InformationTok">
+  <w:style w:customStyle="1" w:styleId="InformationTok" w:type="character">
     <w:name w:val="InformationTok"/>
     <w:basedOn w:val="VerbatimChar"/>
     <w:rPr>
@@ -3117,7 +3466,7 @@
       <w:color w:val="60a0b0"/>
     </w:rPr>
   </w:style>
-  <w:style w:type="character" w:customStyle="1" w:styleId="WarningTok">
+  <w:style w:customStyle="1" w:styleId="WarningTok" w:type="character">
     <w:name w:val="WarningTok"/>
     <w:basedOn w:val="VerbatimChar"/>
     <w:rPr>
@@ -3126,7 +3475,7 @@
       <w:color w:val="60a0b0"/>
     </w:rPr>
   </w:style>
-  <w:style w:type="character" w:customStyle="1" w:styleId="AlertTok">
+  <w:style w:customStyle="1" w:styleId="AlertTok" w:type="character">
     <w:name w:val="AlertTok"/>
     <w:basedOn w:val="VerbatimChar"/>
     <w:rPr>
@@ -3134,7 +3483,7 @@
       <w:color w:val="ff0000"/>
     </w:rPr>
   </w:style>
-  <w:style w:type="character" w:customStyle="1" w:styleId="ErrorTok">
+  <w:style w:customStyle="1" w:styleId="ErrorTok" w:type="character">
     <w:name w:val="ErrorTok"/>
     <w:basedOn w:val="VerbatimChar"/>
     <w:rPr>
@@ -3142,7 +3491,7 @@
       <w:color w:val="ff0000"/>
     </w:rPr>
   </w:style>
-  <w:style w:type="character" w:customStyle="1" w:styleId="NormalTok">
+  <w:style w:customStyle="1" w:styleId="NormalTok" w:type="character">
     <w:name w:val="NormalTok"/>
     <w:basedOn w:val="VerbatimChar"/>
     <w:rPr/>

</xml_diff>